<commit_message>
Add custom tab stops, table style definitions, and table header-row/cell-margin support
Adds ParagraphFormat.TabStops (left/center/right/decimal/bar alignment, dot/hyphen/
underscore/heavy/middle-dot leaders), Document.TableStyles (custom table style
definitions covering whole-table borders plus first-row and banded-row conditional
formatting), and TableRow.RepeatAsHeader / TableEntry.CellMargins - wired through
Writer, Reader, StyleRegistry, CodeGen, Xml, and Json, with a new test scenario
covering all three.

Also fixes a latent bug found along the way: Writer.fs built table row height via
TableRowProperties(TableRowHeight(...)), the exact single-argument-constructor
pitfall documented in CLAUDE.md, which silently dropped every row's height on
write. Fixed with AppendChild and now covered by a test.

Co-Authored-By: Claude Sonnet 5 <noreply@anthropic.com>
</commit_message>
<xml_diff>
--- a/tests/Kookerella.FsWordDsl.Tests/Examples/HeaderFooterFirstPageDifferent/output.docx
+++ b/tests/Kookerella.FsWordDsl.Tests/Examples/HeaderFooterFirstPageDifferent/output.docx
@@ -14,8 +14,8 @@
       </w:r>
     </w:p>
     <w:sectPr>
-      <w:headerReference xmlns:r="http://schemas.openxmlformats.org/officeDocument/2006/relationships" w:type="first" r:id="R64a4baec73a94dca"/>
-      <w:headerReference xmlns:r="http://schemas.openxmlformats.org/officeDocument/2006/relationships" w:type="default" r:id="R6ff7b1847b5e4151"/>
+      <w:headerReference xmlns:r="http://schemas.openxmlformats.org/officeDocument/2006/relationships" w:type="first" r:id="R2f3b16f0f275413e"/>
+      <w:headerReference xmlns:r="http://schemas.openxmlformats.org/officeDocument/2006/relationships" w:type="default" r:id="R60370174537249b0"/>
       <w:pgSz w:w="12240" w:h="15840"/>
       <w:pgMar w:top="1440" w:right="1440" w:bottom="1440" w:left="1440" w:header="720" w:footer="720" w:gutter="0"/>
       <w:titlePg/>

</xml_diff>

<commit_message>
Add multi-paragraph comment support
Adds Inline.CommentRangeStart/CommentRangeEnd, mirroring the BookmarkRangeStart/
BookmarkRangeEnd pattern: two independent markers a caller places in separate
paragraphs to comment a range spanning more than one, rather than the single-paragraph
wrapping Comment case. Unlike a bookmark's name, OOXML has no attribute to persist an
arbitrary string alongside a comment range (only a numeric w:id, which Writer still
assigns itself), so CommentRangeStart's id is write-time-only - a documented,
intentional gap from exact round-trip fidelity on that one field, which the test
harness's own comparison now normalizes away (same treatment DocumentProtection's
Password already gets there).

Wired through Writer, Reader, CodeGen, Xml, and Json, with a new test scenario.

Co-Authored-By: Claude Sonnet 5 <noreply@anthropic.com>
</commit_message>
<xml_diff>
--- a/tests/Kookerella.FsWordDsl.Tests/Examples/HeaderFooterFirstPageDifferent/output.docx
+++ b/tests/Kookerella.FsWordDsl.Tests/Examples/HeaderFooterFirstPageDifferent/output.docx
@@ -14,8 +14,8 @@
       </w:r>
     </w:p>
     <w:sectPr>
-      <w:headerReference xmlns:r="http://schemas.openxmlformats.org/officeDocument/2006/relationships" w:type="first" r:id="Rdd2989bdb3954f76"/>
-      <w:headerReference xmlns:r="http://schemas.openxmlformats.org/officeDocument/2006/relationships" w:type="default" r:id="R90b103f62513498e"/>
+      <w:headerReference xmlns:r="http://schemas.openxmlformats.org/officeDocument/2006/relationships" w:type="first" r:id="R59fcd39ecbed4258"/>
+      <w:headerReference xmlns:r="http://schemas.openxmlformats.org/officeDocument/2006/relationships" w:type="default" r:id="R08d07c1d105e45a3"/>
       <w:pgSz w:w="12240" w:h="15840"/>
       <w:pgMar w:top="1440" w:right="1440" w:bottom="1440" w:left="1440" w:header="720" w:footer="720" w:gutter="0"/>
       <w:titlePg/>

</xml_diff>

<commit_message>
Add content controls (structured document tags)
Models five of Word's w:sdt control kinds - plain text, rich text, dropdown/combo box,
date picker, and checkbox - at both run-level (Inline.InlineContentControl) and
block-level (Block.ContentControlBlock). The reader's existing w:sdt handling (added
during the earlier reader-crash fix) now builds a real ContentControlBlock instead of
just unwrapping and discarding the wrapper.

Co-Authored-By: Claude Sonnet 5 <noreply@anthropic.com>
</commit_message>
<xml_diff>
--- a/tests/Kookerella.FsWordDsl.Tests/Examples/HeaderFooterFirstPageDifferent/output.docx
+++ b/tests/Kookerella.FsWordDsl.Tests/Examples/HeaderFooterFirstPageDifferent/output.docx
@@ -14,8 +14,8 @@
       </w:r>
     </w:p>
     <w:sectPr>
-      <w:headerReference xmlns:r="http://schemas.openxmlformats.org/officeDocument/2006/relationships" w:type="first" r:id="R78e0514278e24303"/>
-      <w:headerReference xmlns:r="http://schemas.openxmlformats.org/officeDocument/2006/relationships" w:type="default" r:id="R8cef42e39ff04217"/>
+      <w:headerReference xmlns:r="http://schemas.openxmlformats.org/officeDocument/2006/relationships" w:type="first" r:id="R95821e836ab84690"/>
+      <w:headerReference xmlns:r="http://schemas.openxmlformats.org/officeDocument/2006/relationships" w:type="default" r:id="R7528feef1935495b"/>
       <w:pgSz w:w="12240" w:h="15840"/>
       <w:pgMar w:top="1440" w:right="1440" w:bottom="1440" w:left="1440" w:header="720" w:footer="720" w:gutter="0"/>
       <w:titlePg/>

</xml_diff>